<commit_message>
Rebrand colours to match the LTS site (ltstest.dedicated.co.za)
Swaps the blue/teal/green palette for a navy/blue/teal scheme sampled
from the reference site: deep navy for the topbar, hero and headings,
a teal-to-blue diagonal for the logo and accent gradient, and a teal
pill for the LOGIN button (was indigo). Applied via the existing CSS
custom properties, so every derived usage (buttons, badges, price
highlights, checkmarks, focus rings) updates from one place — layout
and structure are unchanged.

Also updates the two SVG assets that had brand colours baked in
(hero-calculator.svg's screen gradient, hex-tile.svg's stroke),
rebuilds the standalone HTML, and ships a refreshed feedback form
with new screenshots of the rebranded UI.

Co-Authored-By: Claude Sonnet 5 <noreply@anthropic.com>
Claude-Session: https://claude.ai/code/session_01MyzjcWcaYPLNWygDxYahJu
</commit_message>
<xml_diff>
--- a/dist/LTS-Pricing-Calculator-Feedback-Form.docx
+++ b/dist/LTS-Pricing-Calculator-Feedback-Form.docx
@@ -5,7 +5,7 @@
     <w:p>
       <w:pPr>
         <w:pBdr>
-          <w:bottom w:val="single" w:color="1A2AE6" w:sz="18" w:space="8"/>
+          <w:bottom w:val="single" w:color="0F2C52" w:sz="18" w:space="8"/>
         </w:pBdr>
         <w:spacing w:after="40"/>
       </w:pPr>
@@ -13,7 +13,7 @@
         <w:rPr>
           <w:b/>
           <w:bCs/>
-          <w:color w:val="1A2AE6"/>
+          <w:color w:val="0F2C52"/>
           <w:sz w:val="32"/>
           <w:szCs w:val="32"/>
         </w:rPr>
@@ -23,11 +23,11 @@
         <w:rPr>
           <w:b/>
           <w:bCs/>
-          <w:color w:val="101B33"/>
+          <w:color w:val="16233C"/>
           <w:sz w:val="32"/>
           <w:szCs w:val="32"/>
         </w:rPr>
-        <w:t xml:space="preserve">  Pricing Calculator — Feedback Form (v2)</w:t>
+        <w:t xml:space="preserve">  Pricing Calculator — Feedback Form (v3)</w:t>
       </w:r>
     </w:p>
     <w:p>
@@ -38,11 +38,11 @@
         <w:rPr>
           <w:i/>
           <w:iCs/>
-          <w:color w:val="5B6478"/>
+          <w:color w:val="5C6B83"/>
           <w:sz w:val="20"/>
           <w:szCs w:val="20"/>
         </w:rPr>
-        <w:t xml:space="preserve">Updated with your last round of changes — please review and mark up anything else you'd like changed.</w:t>
+        <w:t xml:space="preserve">Updated with the new branding and the reworked "cost of not using LTS" section — please review and mark up anything else you'd like changed.</w:t>
       </w:r>
     </w:p>
     <w:p>
@@ -53,7 +53,7 @@
         <w:rPr>
           <w:b/>
           <w:bCs/>
-          <w:color w:val="101B33"/>
+          <w:color w:val="16233C"/>
           <w:sz w:val="19"/>
           <w:szCs w:val="19"/>
         </w:rPr>
@@ -65,7 +65,7 @@
           <w:sz w:val="19"/>
           <w:szCs w:val="19"/>
         </w:rPr>
-        <w:t xml:space="preserve">"I am a" section removed · Get started goes straight to Your Estimate · new lines default to the 3-Year Contract · product titles/wording updated · Estimated Annual now includes the 6.6% escalation from 1 April · "+ Add line" now lets you pick a product · the Totals screen has a pending-review note, since we're still waiting on the details you mentioned sending through.</w:t>
+        <w:t xml:space="preserve">colours updated to match the LTS site (ltstest.dedicated.co.za) — navy header/hero, teal-to-blue logo and accents, teal buttons · the "cost of NOT using LTS" section rebuilt around Susan's four categories (learner &amp; programme admin, monitoring &amp; follow-up, reporting &amp; compliance, management time), with an editable trainee count instead of one auto-summed figure.</w:t>
       </w:r>
     </w:p>
     <w:p>
@@ -77,7 +77,7 @@
         <w:rPr>
           <w:b/>
           <w:bCs/>
-          <w:color w:val="1A2AE6"/>
+          <w:color w:val="0F2C52"/>
           <w:sz w:val="26"/>
           <w:szCs w:val="26"/>
         </w:rPr>
@@ -135,7 +135,7 @@
           <w:sz w:val="20"/>
           <w:szCs w:val="20"/>
         </w:rPr>
-        <w:t xml:space="preserve">Type your written comments in the blue box underneath each screenshot — there's more room this time.</w:t>
+        <w:t xml:space="preserve">Type your written comments in the box underneath each screenshot.</w:t>
       </w:r>
     </w:p>
     <w:p>
@@ -182,7 +182,7 @@
         <w:rPr>
           <w:b/>
           <w:bCs/>
-          <w:color w:val="101B33"/>
+          <w:color w:val="16233C"/>
           <w:sz w:val="20"/>
           <w:szCs w:val="20"/>
         </w:rPr>
@@ -205,7 +205,7 @@
         <w:rPr>
           <w:b/>
           <w:bCs/>
-          <w:color w:val="101B33"/>
+          <w:color w:val="16233C"/>
           <w:sz w:val="20"/>
           <w:szCs w:val="20"/>
         </w:rPr>
@@ -233,7 +233,7 @@
         <w:rPr>
           <w:b/>
           <w:bCs/>
-          <w:color w:val="101B33"/>
+          <w:color w:val="16233C"/>
           <w:sz w:val="24"/>
           <w:szCs w:val="24"/>
         </w:rPr>
@@ -248,11 +248,11 @@
         <w:rPr>
           <w:i/>
           <w:iCs/>
-          <w:color w:val="5B6478"/>
+          <w:color w:val="5C6B83"/>
           <w:sz w:val="18"/>
           <w:szCs w:val="18"/>
         </w:rPr>
-        <w:t xml:space="preserve">The header (logo, live cost estimate, login) and the pricing calculator hero banner. "Get started with LTS" now adds the platform and takes you straight to Your Estimate.</w:t>
+        <w:t xml:space="preserve">The header (logo, live cost estimate, login) and the pricing calculator hero banner, in the new navy/teal colour scheme.</w:t>
       </w:r>
     </w:p>
     <w:p>
@@ -263,7 +263,7 @@
       <w:r>
         <w:drawing>
           <wp:inline distT="0" distB="0" distL="0" distR="0">
-            <wp:extent cx="5905500" cy="2781300"/>
+            <wp:extent cx="5905500" cy="2962275"/>
             <wp:effectExtent t="0" r="0" b="0" l="0"/>
             <wp:docPr id="1" name="" descr="" title=""/>
             <wp:cNvGraphicFramePr>
@@ -288,7 +288,7 @@
                   <pic:spPr bwMode="auto">
                     <a:xfrm>
                       <a:off x="0" y="0"/>
-                      <a:ext cx="5905500" cy="2781300"/>
+                      <a:ext cx="5905500" cy="2962275"/>
                     </a:xfrm>
                     <a:prstGeom prst="rect">
                       <a:avLst/>
@@ -305,10 +305,10 @@
       <w:tblPr>
         <w:tblW w:type="dxa" w:w="9500"/>
         <w:tblBorders>
-          <w:top w:val="single" w:color="1A2AE6" w:sz="8"/>
-          <w:left w:val="single" w:color="1A2AE6" w:sz="8"/>
-          <w:bottom w:val="single" w:color="1A2AE6" w:sz="8"/>
-          <w:right w:val="single" w:color="1A2AE6" w:sz="8"/>
+          <w:top w:val="single" w:color="1EA89A" w:sz="8"/>
+          <w:left w:val="single" w:color="1EA89A" w:sz="8"/>
+          <w:bottom w:val="single" w:color="1EA89A" w:sz="8"/>
+          <w:right w:val="single" w:color="1EA89A" w:sz="8"/>
           <w:insideH w:val="single" w:color="auto" w:sz="4"/>
           <w:insideV w:val="single" w:color="auto" w:sz="4"/>
         </w:tblBorders>
@@ -320,7 +320,7 @@
         <w:tc>
           <w:tcPr>
             <w:tcW w:type="dxa" w:w="9500"/>
-            <w:shd w:fill="F5F7FB" w:color="auto" w:val="clear"/>
+            <w:shd w:fill="EEF5FB" w:color="auto" w:val="clear"/>
             <w:tcMar>
               <w:top w:type="dxa" w:w="100"/>
               <w:left w:type="dxa" w:w="160"/>
@@ -336,7 +336,7 @@
               <w:rPr>
                 <w:b/>
                 <w:bCs/>
-                <w:color w:val="1A2AE6"/>
+                <w:color w:val="0F2C52"/>
                 <w:sz w:val="19"/>
                 <w:szCs w:val="19"/>
               </w:rPr>
@@ -443,7 +443,7 @@
         <w:rPr>
           <w:b/>
           <w:bCs/>
-          <w:color w:val="101B33"/>
+          <w:color w:val="16233C"/>
           <w:sz w:val="24"/>
           <w:szCs w:val="24"/>
         </w:rPr>
@@ -458,11 +458,11 @@
         <w:rPr>
           <w:i/>
           <w:iCs/>
-          <w:color w:val="5B6478"/>
+          <w:color w:val="5C6B83"/>
           <w:sz w:val="18"/>
           <w:szCs w:val="18"/>
         </w:rPr>
-        <w:t xml:space="preserve">Both products, with the updated titles and pricing wording.</w:t>
+        <w:t xml:space="preserve">Both products currently listed: the core platform, and the Time Sheet add-on.</w:t>
       </w:r>
     </w:p>
     <w:p>
@@ -515,10 +515,10 @@
       <w:tblPr>
         <w:tblW w:type="dxa" w:w="9500"/>
         <w:tblBorders>
-          <w:top w:val="single" w:color="1A2AE6" w:sz="8"/>
-          <w:left w:val="single" w:color="1A2AE6" w:sz="8"/>
-          <w:bottom w:val="single" w:color="1A2AE6" w:sz="8"/>
-          <w:right w:val="single" w:color="1A2AE6" w:sz="8"/>
+          <w:top w:val="single" w:color="1EA89A" w:sz="8"/>
+          <w:left w:val="single" w:color="1EA89A" w:sz="8"/>
+          <w:bottom w:val="single" w:color="1EA89A" w:sz="8"/>
+          <w:right w:val="single" w:color="1EA89A" w:sz="8"/>
           <w:insideH w:val="single" w:color="auto" w:sz="4"/>
           <w:insideV w:val="single" w:color="auto" w:sz="4"/>
         </w:tblBorders>
@@ -530,7 +530,7 @@
         <w:tc>
           <w:tcPr>
             <w:tcW w:type="dxa" w:w="9500"/>
-            <w:shd w:fill="F5F7FB" w:color="auto" w:val="clear"/>
+            <w:shd w:fill="EEF5FB" w:color="auto" w:val="clear"/>
             <w:tcMar>
               <w:top w:type="dxa" w:w="100"/>
               <w:left w:type="dxa" w:w="160"/>
@@ -546,7 +546,7 @@
               <w:rPr>
                 <w:b/>
                 <w:bCs/>
-                <w:color w:val="1A2AE6"/>
+                <w:color w:val="0F2C52"/>
                 <w:sz w:val="19"/>
                 <w:szCs w:val="19"/>
               </w:rPr>
@@ -653,7 +653,7 @@
         <w:rPr>
           <w:b/>
           <w:bCs/>
-          <w:color w:val="101B33"/>
+          <w:color w:val="16233C"/>
           <w:sz w:val="24"/>
           <w:szCs w:val="24"/>
         </w:rPr>
@@ -668,11 +668,11 @@
         <w:rPr>
           <w:i/>
           <w:iCs/>
-          <w:color w:val="5B6478"/>
+          <w:color w:val="5C6B83"/>
           <w:sz w:val="18"/>
           <w:szCs w:val="18"/>
         </w:rPr>
-        <w:t xml:space="preserve">A platform line (60 trainees, now defaulting to the 3-Year Contract) plus a Time Sheet line (3 users, confirmed pricing), on the Estimate tab.</w:t>
+        <w:t xml:space="preserve">A platform line (60 trainees, 2-Year Contract) plus a Time Sheet line (3 users), on the Estimate tab.</w:t>
       </w:r>
     </w:p>
     <w:p>
@@ -725,10 +725,10 @@
       <w:tblPr>
         <w:tblW w:type="dxa" w:w="9500"/>
         <w:tblBorders>
-          <w:top w:val="single" w:color="1A2AE6" w:sz="8"/>
-          <w:left w:val="single" w:color="1A2AE6" w:sz="8"/>
-          <w:bottom w:val="single" w:color="1A2AE6" w:sz="8"/>
-          <w:right w:val="single" w:color="1A2AE6" w:sz="8"/>
+          <w:top w:val="single" w:color="1EA89A" w:sz="8"/>
+          <w:left w:val="single" w:color="1EA89A" w:sz="8"/>
+          <w:bottom w:val="single" w:color="1EA89A" w:sz="8"/>
+          <w:right w:val="single" w:color="1EA89A" w:sz="8"/>
           <w:insideH w:val="single" w:color="auto" w:sz="4"/>
           <w:insideV w:val="single" w:color="auto" w:sz="4"/>
         </w:tblBorders>
@@ -740,7 +740,7 @@
         <w:tc>
           <w:tcPr>
             <w:tcW w:type="dxa" w:w="9500"/>
-            <w:shd w:fill="F5F7FB" w:color="auto" w:val="clear"/>
+            <w:shd w:fill="EEF5FB" w:color="auto" w:val="clear"/>
             <w:tcMar>
               <w:top w:type="dxa" w:w="100"/>
               <w:left w:type="dxa" w:w="160"/>
@@ -756,7 +756,7 @@
               <w:rPr>
                 <w:b/>
                 <w:bCs/>
-                <w:color w:val="1A2AE6"/>
+                <w:color w:val="0F2C52"/>
                 <w:sz w:val="19"/>
                 <w:szCs w:val="19"/>
               </w:rPr>
@@ -887,7 +887,7 @@
         <w:rPr>
           <w:b/>
           <w:bCs/>
-          <w:color w:val="101B33"/>
+          <w:color w:val="16233C"/>
           <w:sz w:val="24"/>
           <w:szCs w:val="24"/>
         </w:rPr>
@@ -902,11 +902,11 @@
         <w:rPr>
           <w:i/>
           <w:iCs/>
-          <w:color w:val="5B6478"/>
+          <w:color w:val="5C6B83"/>
           <w:sz w:val="18"/>
           <w:szCs w:val="18"/>
         </w:rPr>
-        <w:t xml:space="preserve">The running total, VAT toggle, Export to Excel — flagged with a pending-review note since we're still waiting on the details you said you'd send through for this screen.</w:t>
+        <w:t xml:space="preserve">The running total for the estimate, VAT toggle, and Export to Excel.</w:t>
       </w:r>
     </w:p>
     <w:p>
@@ -959,10 +959,10 @@
       <w:tblPr>
         <w:tblW w:type="dxa" w:w="9500"/>
         <w:tblBorders>
-          <w:top w:val="single" w:color="1A2AE6" w:sz="8"/>
-          <w:left w:val="single" w:color="1A2AE6" w:sz="8"/>
-          <w:bottom w:val="single" w:color="1A2AE6" w:sz="8"/>
-          <w:right w:val="single" w:color="1A2AE6" w:sz="8"/>
+          <w:top w:val="single" w:color="1EA89A" w:sz="8"/>
+          <w:left w:val="single" w:color="1EA89A" w:sz="8"/>
+          <w:bottom w:val="single" w:color="1EA89A" w:sz="8"/>
+          <w:right w:val="single" w:color="1EA89A" w:sz="8"/>
           <w:insideH w:val="single" w:color="auto" w:sz="4"/>
           <w:insideV w:val="single" w:color="auto" w:sz="4"/>
         </w:tblBorders>
@@ -974,7 +974,7 @@
         <w:tc>
           <w:tcPr>
             <w:tcW w:type="dxa" w:w="9500"/>
-            <w:shd w:fill="F5F7FB" w:color="auto" w:val="clear"/>
+            <w:shd w:fill="EEF5FB" w:color="auto" w:val="clear"/>
             <w:tcMar>
               <w:top w:type="dxa" w:w="100"/>
               <w:left w:type="dxa" w:w="160"/>
@@ -990,7 +990,7 @@
               <w:rPr>
                 <w:b/>
                 <w:bCs/>
-                <w:color w:val="1A2AE6"/>
+                <w:color w:val="0F2C52"/>
                 <w:sz w:val="19"/>
                 <w:szCs w:val="19"/>
               </w:rPr>
@@ -1121,7 +1121,7 @@
         <w:rPr>
           <w:b/>
           <w:bCs/>
-          <w:color w:val="101B33"/>
+          <w:color w:val="16233C"/>
           <w:sz w:val="24"/>
           <w:szCs w:val="24"/>
         </w:rPr>
@@ -1136,11 +1136,11 @@
         <w:rPr>
           <w:i/>
           <w:iCs/>
-          <w:color w:val="5B6478"/>
+          <w:color w:val="5C6B83"/>
           <w:sz w:val="18"/>
           <w:szCs w:val="18"/>
         </w:rPr>
-        <w:t xml:space="preserve">The manual-vs-LTS comparison, showing the time and money LTS saves.</w:t>
+        <w:t xml:space="preserve">Rebuilt around Susan's four hidden-cost categories, with an editable trainee count and a category-by-category breakdown.</w:t>
       </w:r>
     </w:p>
     <w:p>
@@ -1151,7 +1151,7 @@
       <w:r>
         <w:drawing>
           <wp:inline distT="0" distB="0" distL="0" distR="0">
-            <wp:extent cx="5905500" cy="2876550"/>
+            <wp:extent cx="5905500" cy="6467475"/>
             <wp:effectExtent t="0" r="0" b="0" l="0"/>
             <wp:docPr id="1" name="" descr="" title=""/>
             <wp:cNvGraphicFramePr>
@@ -1176,7 +1176,7 @@
                   <pic:spPr bwMode="auto">
                     <a:xfrm>
                       <a:off x="0" y="0"/>
-                      <a:ext cx="5905500" cy="2876550"/>
+                      <a:ext cx="5905500" cy="6467475"/>
                     </a:xfrm>
                     <a:prstGeom prst="rect">
                       <a:avLst/>
@@ -1193,10 +1193,10 @@
       <w:tblPr>
         <w:tblW w:type="dxa" w:w="9500"/>
         <w:tblBorders>
-          <w:top w:val="single" w:color="1A2AE6" w:sz="8"/>
-          <w:left w:val="single" w:color="1A2AE6" w:sz="8"/>
-          <w:bottom w:val="single" w:color="1A2AE6" w:sz="8"/>
-          <w:right w:val="single" w:color="1A2AE6" w:sz="8"/>
+          <w:top w:val="single" w:color="1EA89A" w:sz="8"/>
+          <w:left w:val="single" w:color="1EA89A" w:sz="8"/>
+          <w:bottom w:val="single" w:color="1EA89A" w:sz="8"/>
+          <w:right w:val="single" w:color="1EA89A" w:sz="8"/>
           <w:insideH w:val="single" w:color="auto" w:sz="4"/>
           <w:insideV w:val="single" w:color="auto" w:sz="4"/>
         </w:tblBorders>
@@ -1208,7 +1208,7 @@
         <w:tc>
           <w:tcPr>
             <w:tcW w:type="dxa" w:w="9500"/>
-            <w:shd w:fill="F5F7FB" w:color="auto" w:val="clear"/>
+            <w:shd w:fill="EEF5FB" w:color="auto" w:val="clear"/>
             <w:tcMar>
               <w:top w:type="dxa" w:w="100"/>
               <w:left w:type="dxa" w:w="160"/>
@@ -1224,7 +1224,7 @@
               <w:rPr>
                 <w:b/>
                 <w:bCs/>
-                <w:color w:val="1A2AE6"/>
+                <w:color w:val="0F2C52"/>
                 <w:sz w:val="19"/>
                 <w:szCs w:val="19"/>
               </w:rPr>
@@ -1356,7 +1356,7 @@
         <w:rPr>
           <w:b/>
           <w:bCs/>
-          <w:color w:val="1A2AE6"/>
+          <w:color w:val="0F2C52"/>
           <w:sz w:val="26"/>
           <w:szCs w:val="26"/>
         </w:rPr>
@@ -1380,10 +1380,10 @@
       <w:tblPr>
         <w:tblW w:type="dxa" w:w="9500"/>
         <w:tblBorders>
-          <w:top w:val="single" w:color="1A2AE6" w:sz="8"/>
-          <w:left w:val="single" w:color="1A2AE6" w:sz="8"/>
-          <w:bottom w:val="single" w:color="1A2AE6" w:sz="8"/>
-          <w:right w:val="single" w:color="1A2AE6" w:sz="8"/>
+          <w:top w:val="single" w:color="1EA89A" w:sz="8"/>
+          <w:left w:val="single" w:color="1EA89A" w:sz="8"/>
+          <w:bottom w:val="single" w:color="1EA89A" w:sz="8"/>
+          <w:right w:val="single" w:color="1EA89A" w:sz="8"/>
           <w:insideH w:val="single" w:color="auto" w:sz="4"/>
           <w:insideV w:val="single" w:color="auto" w:sz="4"/>
         </w:tblBorders>
@@ -1395,7 +1395,7 @@
         <w:tc>
           <w:tcPr>
             <w:tcW w:type="dxa" w:w="9500"/>
-            <w:shd w:fill="F5F7FB" w:color="auto" w:val="clear"/>
+            <w:shd w:fill="EEF5FB" w:color="auto" w:val="clear"/>
             <w:tcMar>
               <w:top w:type="dxa" w:w="100"/>
               <w:left w:type="dxa" w:w="160"/>
@@ -1411,7 +1411,7 @@
               <w:rPr>
                 <w:b/>
                 <w:bCs/>
-                <w:color w:val="1A2AE6"/>
+                <w:color w:val="0F2C52"/>
                 <w:sz w:val="19"/>
                 <w:szCs w:val="19"/>
               </w:rPr>

</xml_diff>

<commit_message>
Refresh feedback form (v4) with screenshots of the latest fixes
New screenshots showing: pending banner removed, the "cost of NOT
using LTS" trainee count summing and live-syncing across lines
(60 + 15 = 75), the new title/subtitle wording, and Time Sheet
defaulting to 15 users.

Co-Authored-By: Claude Sonnet 5 <noreply@anthropic.com>
Claude-Session: https://claude.ai/code/session_01MyzjcWcaYPLNWygDxYahJu
</commit_message>
<xml_diff>
--- a/dist/LTS-Pricing-Calculator-Feedback-Form.docx
+++ b/dist/LTS-Pricing-Calculator-Feedback-Form.docx
@@ -27,7 +27,7 @@
           <w:sz w:val="32"/>
           <w:szCs w:val="32"/>
         </w:rPr>
-        <w:t xml:space="preserve">  Pricing Calculator — Feedback Form (v3)</w:t>
+        <w:t xml:space="preserve">  Pricing Calculator — Feedback Form (v4)</w:t>
       </w:r>
     </w:p>
     <w:p>
@@ -42,7 +42,7 @@
           <w:sz w:val="20"/>
           <w:szCs w:val="20"/>
         </w:rPr>
-        <w:t xml:space="preserve">Updated with the new branding and the reworked "cost of not using LTS" section — please review and mark up anything else you'd like changed.</w:t>
+        <w:t xml:space="preserve">Applied your last round of feedback — please review and mark up anything else you'd like changed.</w:t>
       </w:r>
     </w:p>
     <w:p>
@@ -65,7 +65,7 @@
           <w:sz w:val="19"/>
           <w:szCs w:val="19"/>
         </w:rPr>
-        <w:t xml:space="preserve">colours updated to match the LTS site (ltstest.dedicated.co.za) — navy header/hero, teal-to-blue logo and accents, teal buttons · the "cost of NOT using LTS" section rebuilt around Susan's four categories (learner &amp; programme admin, monitoring &amp; follow-up, reporting &amp; compliance, management time), with an editable trainee count instead of one auto-summed figure.</w:t>
+        <w:t xml:space="preserve">removed the Totals pending-review banner · fixed the “cost of NOT using LTS” trainee/employee count so it sums EVERY line (trainees + Time Sheet users) and stays live-synced as you edit any line · reworded the section to “What is manual training administration really costing you?” · updated the Excel export contact number to +27 12 253 0017 · confirmed Time Sheet still defaults to 15 users via both “Add to estimate” and “+ Add line”.</w:t>
       </w:r>
     </w:p>
     <w:p>
@@ -252,7 +252,7 @@
           <w:sz w:val="18"/>
           <w:szCs w:val="18"/>
         </w:rPr>
-        <w:t xml:space="preserve">The header (logo, live cost estimate, login) and the pricing calculator hero banner, in the new navy/teal colour scheme.</w:t>
+        <w:t xml:space="preserve">The header (logo, live cost estimate, login) and the pricing calculator hero banner.</w:t>
       </w:r>
     </w:p>
     <w:p>
@@ -672,7 +672,7 @@
           <w:sz w:val="18"/>
           <w:szCs w:val="18"/>
         </w:rPr>
-        <w:t xml:space="preserve">A platform line (60 trainees, 2-Year Contract) plus a Time Sheet line (3 users), on the Estimate tab.</w:t>
+        <w:t xml:space="preserve">A platform line (60 trainees, 2-Year Contract) plus a Time Sheet line (15 users, the new default), on the Estimate tab.</w:t>
       </w:r>
     </w:p>
     <w:p>
@@ -906,7 +906,7 @@
           <w:sz w:val="18"/>
           <w:szCs w:val="18"/>
         </w:rPr>
-        <w:t xml:space="preserve">The running total for the estimate, VAT toggle, and Export to Excel.</w:t>
+        <w:t xml:space="preserve">The running total, VAT toggle, Export to Excel — pending-review banner removed.</w:t>
       </w:r>
     </w:p>
     <w:p>
@@ -917,7 +917,7 @@
       <w:r>
         <w:drawing>
           <wp:inline distT="0" distB="0" distL="0" distR="0">
-            <wp:extent cx="5905500" cy="1943100"/>
+            <wp:extent cx="5905500" cy="1638300"/>
             <wp:effectExtent t="0" r="0" b="0" l="0"/>
             <wp:docPr id="1" name="" descr="" title=""/>
             <wp:cNvGraphicFramePr>
@@ -942,7 +942,7 @@
                   <pic:spPr bwMode="auto">
                     <a:xfrm>
                       <a:off x="0" y="0"/>
-                      <a:ext cx="5905500" cy="1943100"/>
+                      <a:ext cx="5905500" cy="1638300"/>
                     </a:xfrm>
                     <a:prstGeom prst="rect">
                       <a:avLst/>
@@ -1140,7 +1140,7 @@
           <w:sz w:val="18"/>
           <w:szCs w:val="18"/>
         </w:rPr>
-        <w:t xml:space="preserve">Rebuilt around Susan's four hidden-cost categories, with an editable trainee count and a category-by-category breakdown.</w:t>
+        <w:t xml:space="preserve">New title/subtitle wording. The trainee/employee count now sums both lines (60 + 15 = 75) and updates live as either line changes.</w:t>
       </w:r>
     </w:p>
     <w:p>

</xml_diff>